<commit_message>
Add structure strategy evaluation and task 9 QA planning
</commit_message>
<xml_diff>
--- a/FedTabRAG_下一阶段实验工作安排.docx
+++ b/FedTabRAG_下一阶段实验工作安排.docx
@@ -3519,6 +3519,327 @@
     </w:tbl>
     <w:p>
       <w:pPr>
+        <w:pStyle w:val="Heading3"/>
+      </w:pPr>
+      <w:r>
+        <w:t>任务 4实际执行与验收结果（2026-08-20）</w:t>
+      </w:r>
+    </w:p>
+    <w:p>
+      <w:r>
+        <w:t>执行状态：FAIL_GATE。任务4的dev-only冻结BGE置信度门控已完成，但40个配置均未达到预注册门槛，不允许据此进入正式test。</w:t>
+      </w:r>
+    </w:p>
+    <w:p>
+      <w:pPr>
+        <w:pStyle w:val="ListBullet"/>
+      </w:pPr>
+      <w:r>
+        <w:t>实现脚本：src/retrieval/evaluate_confidence_gating.py。脚本只读取两路冻结dev检索结果，不加载模型、不训练、不重新编码；对每个query统一选择Flat或UniTable三层结果。</w:t>
+      </w:r>
+    </w:p>
+    <w:p>
+      <w:pPr>
+        <w:pStyle w:val="ListBullet"/>
+      </w:pPr>
+      <w:r>
+        <w:t>输入包括Flat/UniTable dev检索结果、pairwise dev表、结构质量文件、evidence_map和冻结5客户端划分；覆盖883个dev query，并校验模型指纹、检索协议、query覆盖和split。</w:t>
+      </w:r>
+    </w:p>
+    <w:p>
+      <w:pPr>
+        <w:pStyle w:val="ListBullet"/>
+      </w:pPr>
+      <w:r>
+        <w:t>综合可靠性R=0.40×S-TEDS+0.25×cell-count consistency+0.15×valid_html+0.20×confidence；同时评估S-TEDS、cell-count、valid_html、confidence、综合R和joint-quality阈值族。</w:t>
+      </w:r>
+    </w:p>
+    <w:p>
+      <w:pPr>
+        <w:pStyle w:val="ListBullet"/>
+      </w:pPr>
+      <w:r>
+        <w:t>输出：outputs/diagnosis/gating/gating_dev_grid.csv、gating_dev_best_config.json、gating_dev_summary.md和gating_sha256_manifest.json；日志为outputs/logs/diagnosis_gating.log。</w:t>
+      </w:r>
+    </w:p>
+    <w:tbl>
+      <w:tblPr>
+        <w:tblStyle w:val="TableGrid"/>
+        <w:tblW w:type="auto" w:w="0"/>
+        <w:tblLook w:firstColumn="1" w:firstRow="1" w:lastColumn="0" w:lastRow="0" w:noHBand="0" w:noVBand="1" w:val="04A0"/>
+      </w:tblPr>
+      <w:tblGrid>
+        <w:gridCol w:w="2493"/>
+        <w:gridCol w:w="2493"/>
+        <w:gridCol w:w="2493"/>
+        <w:gridCol w:w="2493"/>
+      </w:tblGrid>
+      <w:tr>
+        <w:tc>
+          <w:tcPr>
+            <w:tcW w:type="dxa" w:w="2493"/>
+          </w:tcPr>
+          <w:p>
+            <w:r>
+              <w:t>dev指标</w:t>
+            </w:r>
+          </w:p>
+        </w:tc>
+        <w:tc>
+          <w:tcPr>
+            <w:tcW w:type="dxa" w:w="2493"/>
+          </w:tcPr>
+          <w:p>
+            <w:r>
+              <w:t>Flat baseline</w:t>
+            </w:r>
+          </w:p>
+        </w:tc>
+        <w:tc>
+          <w:tcPr>
+            <w:tcW w:type="dxa" w:w="2493"/>
+          </w:tcPr>
+          <w:p>
+            <w:r>
+              <w:t>最佳门控</w:t>
+            </w:r>
+          </w:p>
+        </w:tc>
+        <w:tc>
+          <w:tcPr>
+            <w:tcW w:type="dxa" w:w="2493"/>
+          </w:tcPr>
+          <w:p>
+            <w:r>
+              <w:t>变化</w:t>
+            </w:r>
+          </w:p>
+        </w:tc>
+      </w:tr>
+      <w:tr>
+        <w:tc>
+          <w:tcPr>
+            <w:tcW w:type="dxa" w:w="2493"/>
+          </w:tcPr>
+          <w:p>
+            <w:r>
+              <w:t>Weighted NDCG@10</w:t>
+            </w:r>
+          </w:p>
+        </w:tc>
+        <w:tc>
+          <w:tcPr>
+            <w:tcW w:type="dxa" w:w="2493"/>
+          </w:tcPr>
+          <w:p>
+            <w:r>
+              <w:t>0.145597802</w:t>
+            </w:r>
+          </w:p>
+        </w:tc>
+        <w:tc>
+          <w:tcPr>
+            <w:tcW w:type="dxa" w:w="2493"/>
+          </w:tcPr>
+          <w:p>
+            <w:r>
+              <w:t>0.145597802</w:t>
+            </w:r>
+          </w:p>
+        </w:tc>
+        <w:tc>
+          <w:tcPr>
+            <w:tcW w:type="dxa" w:w="2493"/>
+          </w:tcPr>
+          <w:p>
+            <w:r>
+              <w:t>+0.000000000</w:t>
+            </w:r>
+          </w:p>
+        </w:tc>
+      </w:tr>
+      <w:tr>
+        <w:tc>
+          <w:tcPr>
+            <w:tcW w:type="dxa" w:w="2493"/>
+          </w:tcPr>
+          <w:p>
+            <w:r>
+              <w:t>Row Recall@5</w:t>
+            </w:r>
+          </w:p>
+        </w:tc>
+        <w:tc>
+          <w:tcPr>
+            <w:tcW w:type="dxa" w:w="2493"/>
+          </w:tcPr>
+          <w:p>
+            <w:r>
+              <w:t>0.327007299</w:t>
+            </w:r>
+          </w:p>
+        </w:tc>
+        <w:tc>
+          <w:tcPr>
+            <w:tcW w:type="dxa" w:w="2493"/>
+          </w:tcPr>
+          <w:p>
+            <w:r>
+              <w:t>0.327007299</w:t>
+            </w:r>
+          </w:p>
+        </w:tc>
+        <w:tc>
+          <w:tcPr>
+            <w:tcW w:type="dxa" w:w="2493"/>
+          </w:tcPr>
+          <w:p>
+            <w:r>
+              <w:t>+0.000000000</w:t>
+            </w:r>
+          </w:p>
+        </w:tc>
+      </w:tr>
+      <w:tr>
+        <w:tc>
+          <w:tcPr>
+            <w:tcW w:type="dxa" w:w="2493"/>
+          </w:tcPr>
+          <w:p>
+            <w:r>
+              <w:t>Cell Recall@5</w:t>
+            </w:r>
+          </w:p>
+        </w:tc>
+        <w:tc>
+          <w:tcPr>
+            <w:tcW w:type="dxa" w:w="2493"/>
+          </w:tcPr>
+          <w:p>
+            <w:r>
+              <w:t>0.236496350</w:t>
+            </w:r>
+          </w:p>
+        </w:tc>
+        <w:tc>
+          <w:tcPr>
+            <w:tcW w:type="dxa" w:w="2493"/>
+          </w:tcPr>
+          <w:p>
+            <w:r>
+              <w:t>0.236496350</w:t>
+            </w:r>
+          </w:p>
+        </w:tc>
+        <w:tc>
+          <w:tcPr>
+            <w:tcW w:type="dxa" w:w="2493"/>
+          </w:tcPr>
+          <w:p>
+            <w:r>
+              <w:t>+0.000000000</w:t>
+            </w:r>
+          </w:p>
+        </w:tc>
+      </w:tr>
+      <w:tr>
+        <w:tc>
+          <w:tcPr>
+            <w:tcW w:type="dxa" w:w="2493"/>
+          </w:tcPr>
+          <w:p>
+            <w:r>
+              <w:t>Worst-client weighted NDCG@10</w:t>
+            </w:r>
+          </w:p>
+        </w:tc>
+        <w:tc>
+          <w:tcPr>
+            <w:tcW w:type="dxa" w:w="2493"/>
+          </w:tcPr>
+          <w:p>
+            <w:r>
+              <w:t>0.099247224</w:t>
+            </w:r>
+          </w:p>
+        </w:tc>
+        <w:tc>
+          <w:tcPr>
+            <w:tcW w:type="dxa" w:w="2493"/>
+          </w:tcPr>
+          <w:p>
+            <w:r>
+              <w:t>0.099247224</w:t>
+            </w:r>
+          </w:p>
+        </w:tc>
+        <w:tc>
+          <w:tcPr>
+            <w:tcW w:type="dxa" w:w="2493"/>
+          </w:tcPr>
+          <w:p>
+            <w:r>
+              <w:t>+0.000000000</w:t>
+            </w:r>
+          </w:p>
+        </w:tc>
+      </w:tr>
+    </w:tbl>
+    <w:p>
+      <w:r>
+        <w:t>最佳门控配置为g008（S-TEDS≥0.978494624），仅2/883条query（0.23%）使用UniTable；其weighted NDCG、Row/Cell Recall和worst-client均与Flat完全持平。</w:t>
+      </w:r>
+    </w:p>
+    <w:p>
+      <w:r>
+        <w:t>门槛判定：weighted NDCG提升要求≥0.003，实际为0；Row或Cell Recall@5提升要求≥0.01，实际均为0；worst-client约束虽未下降，但不足以弥补前两项失败。40个配置通过数为0。</w:t>
+      </w:r>
+    </w:p>
+    <w:p>
+      <w:r>
+        <w:t>验证结果：新增门控测试与相关测试共11项通过；完整项目测试25 passed、2 warnings。40个config_id唯一，输出SHA256复算一致。</w:t>
+      </w:r>
+    </w:p>
+    <w:p>
+      <w:pPr>
+        <w:pStyle w:val="Heading3"/>
+      </w:pPr>
+      <w:r>
+        <w:t>任务4最终验收：</w:t>
+      </w:r>
+    </w:p>
+    <w:p>
+      <w:r>
+        <w:t>☑ 完全冻结BGE，仅聚合已有dev逐query检索指标；未训练或重新编码。</w:t>
+      </w:r>
+    </w:p>
+    <w:p>
+      <w:r>
+        <w:t>☑ 所有阈值和最佳配置只由dev选择，test未参与搜索或判定。</w:t>
+      </w:r>
+    </w:p>
+    <w:p>
+      <w:r>
+        <w:t>☑ 完整输出40个配置，包含各层级NDCG/Recall、MRR、MAP及global、macro、worst-client和std。</w:t>
+      </w:r>
+    </w:p>
+    <w:p>
+      <w:r>
+        <w:t>☑ 最佳配置、输入/输出路径、协议、可靠性公式和SHA256均已保存。</w:t>
+      </w:r>
+    </w:p>
+    <w:p>
+      <w:r>
+        <w:t>☒ 任务4未达到预注册门槛，不得直接执行任务7正式test。</w:t>
+      </w:r>
+    </w:p>
+    <w:p>
+      <w:r>
+        <w:t>下一步：继续执行任务5的dev-only Flat/UniTable分数后融合；随后由任务6统一冻结方案或输出fail_decision。</w:t>
+      </w:r>
+    </w:p>
+    <w:p>
+      <w:pPr>
         <w:pStyle w:val="Heading2"/>
         <w:spacing w:before="200" w:after="120"/>
       </w:pPr>
@@ -3841,6 +4162,372 @@
     </w:tbl>
     <w:p>
       <w:pPr>
+        <w:pStyle w:val="Heading3"/>
+      </w:pPr>
+      <w:r>
+        <w:t>任务 5实际执行与验收结果（2026-08-20）</w:t>
+      </w:r>
+    </w:p>
+    <w:p>
+      <w:r>
+        <w:t>执行状态：DEV_NUMERIC_CANDIDATE_WITH_POOL_LIMITATION。任务5已完成33项dev-only冻结分数融合；存在1个通过融合池内数值筛查的候选，但受冻结Top-10候选池与跨分支evidence ID口径限制，当前不允许进入正式test。</w:t>
+      </w:r>
+    </w:p>
+    <w:p>
+      <w:pPr>
+        <w:pStyle w:val="ListBullet"/>
+      </w:pPr>
+      <w:r>
+        <w:t>实现脚本：src/retrieval/evaluate_score_fusion.py。脚本不加载模型、不训练、不重新编码，读取两路冻结dev Top-10分数、两路queries、evidence_map及冻结5客户端划分。</w:t>
+      </w:r>
+    </w:p>
+    <w:p>
+      <w:pPr>
+        <w:pStyle w:val="ListBullet"/>
+      </w:pPr>
+      <w:r>
+        <w:t>归一化支持z-score、min-max和rank_score；每种方式搜索alpha∈{0.0,0.1,…,1.0}，公式为final_score=alpha×score_flat+(1-alpha)×score_unitable。</w:t>
+      </w:r>
+    </w:p>
+    <w:p>
+      <w:pPr>
+        <w:pStyle w:val="ListBullet"/>
+      </w:pPr>
+      <w:r>
+        <w:t>候选按精确evidence_id对齐，缺失分数置于该分支归一化最低分以下1单位；Table平均并集大小10.0793，Row/Cell均为20，说明Row/Cell两路Top-10 ID完全不重叠。</w:t>
+      </w:r>
+    </w:p>
+    <w:p>
+      <w:pPr>
+        <w:pStyle w:val="ListBullet"/>
+      </w:pPr>
+      <w:r>
+        <w:t>输出：outputs/diagnosis/fusion/fusion_dev_grid.csv、fusion_dev_best_config.json、fusion_dev_summary.md和fusion_sha256_manifest.json；日志为outputs/logs/diagnosis_fusion.log。</w:t>
+      </w:r>
+    </w:p>
+    <w:tbl>
+      <w:tblPr>
+        <w:tblStyle w:val="TableGrid"/>
+        <w:tblW w:type="auto" w:w="0"/>
+        <w:tblLook w:firstColumn="1" w:firstRow="1" w:lastColumn="0" w:lastRow="0" w:noHBand="0" w:noVBand="1" w:val="04A0"/>
+      </w:tblPr>
+      <w:tblGrid>
+        <w:gridCol w:w="1662"/>
+        <w:gridCol w:w="1662"/>
+        <w:gridCol w:w="1662"/>
+        <w:gridCol w:w="1662"/>
+        <w:gridCol w:w="1662"/>
+        <w:gridCol w:w="1662"/>
+      </w:tblGrid>
+      <w:tr>
+        <w:tc>
+          <w:tcPr>
+            <w:tcW w:type="dxa" w:w="1662"/>
+          </w:tcPr>
+          <w:p>
+            <w:r>
+              <w:t>配置</w:t>
+            </w:r>
+          </w:p>
+        </w:tc>
+        <w:tc>
+          <w:tcPr>
+            <w:tcW w:type="dxa" w:w="1662"/>
+          </w:tcPr>
+          <w:p>
+            <w:r>
+              <w:t>归一化/alpha</w:t>
+            </w:r>
+          </w:p>
+        </w:tc>
+        <w:tc>
+          <w:tcPr>
+            <w:tcW w:type="dxa" w:w="1662"/>
+          </w:tcPr>
+          <w:p>
+            <w:r>
+              <w:t>Weighted NDCG@10</w:t>
+            </w:r>
+          </w:p>
+        </w:tc>
+        <w:tc>
+          <w:tcPr>
+            <w:tcW w:type="dxa" w:w="1662"/>
+          </w:tcPr>
+          <w:p>
+            <w:r>
+              <w:t>ΔNDCG</w:t>
+            </w:r>
+          </w:p>
+        </w:tc>
+        <w:tc>
+          <w:tcPr>
+            <w:tcW w:type="dxa" w:w="1662"/>
+          </w:tcPr>
+          <w:p>
+            <w:r>
+              <w:t>ΔRow R@5</w:t>
+            </w:r>
+          </w:p>
+        </w:tc>
+        <w:tc>
+          <w:tcPr>
+            <w:tcW w:type="dxa" w:w="1662"/>
+          </w:tcPr>
+          <w:p>
+            <w:r>
+              <w:t>ΔCell R@5</w:t>
+            </w:r>
+          </w:p>
+        </w:tc>
+      </w:tr>
+      <w:tr>
+        <w:tc>
+          <w:tcPr>
+            <w:tcW w:type="dxa" w:w="1662"/>
+          </w:tcPr>
+          <w:p>
+            <w:r>
+              <w:t>融合池Flat端点</w:t>
+            </w:r>
+          </w:p>
+        </w:tc>
+        <w:tc>
+          <w:tcPr>
+            <w:tcW w:type="dxa" w:w="1662"/>
+          </w:tcPr>
+          <w:p>
+            <w:r>
+              <w:t>z-score / 1.0</w:t>
+            </w:r>
+          </w:p>
+        </w:tc>
+        <w:tc>
+          <w:tcPr>
+            <w:tcW w:type="dxa" w:w="1662"/>
+          </w:tcPr>
+          <w:p>
+            <w:r>
+              <w:t>0.101138660</w:t>
+            </w:r>
+          </w:p>
+        </w:tc>
+        <w:tc>
+          <w:tcPr>
+            <w:tcW w:type="dxa" w:w="1662"/>
+          </w:tcPr>
+          <w:p>
+            <w:r>
+              <w:t>+0.000000000</w:t>
+            </w:r>
+          </w:p>
+        </w:tc>
+        <w:tc>
+          <w:tcPr>
+            <w:tcW w:type="dxa" w:w="1662"/>
+          </w:tcPr>
+          <w:p>
+            <w:r>
+              <w:t>+0.000000000</w:t>
+            </w:r>
+          </w:p>
+        </w:tc>
+        <w:tc>
+          <w:tcPr>
+            <w:tcW w:type="dxa" w:w="1662"/>
+          </w:tcPr>
+          <w:p>
+            <w:r>
+              <w:t>+0.000000000</w:t>
+            </w:r>
+          </w:p>
+        </w:tc>
+      </w:tr>
+      <w:tr>
+        <w:tc>
+          <w:tcPr>
+            <w:tcW w:type="dxa" w:w="1662"/>
+          </w:tcPr>
+          <w:p>
+            <w:r>
+              <w:t>全局NDCG最高 f016</w:t>
+            </w:r>
+          </w:p>
+        </w:tc>
+        <w:tc>
+          <w:tcPr>
+            <w:tcW w:type="dxa" w:w="1662"/>
+          </w:tcPr>
+          <w:p>
+            <w:r>
+              <w:t>min-max / 0.5</w:t>
+            </w:r>
+          </w:p>
+        </w:tc>
+        <w:tc>
+          <w:tcPr>
+            <w:tcW w:type="dxa" w:w="1662"/>
+          </w:tcPr>
+          <w:p>
+            <w:r>
+              <w:t>0.115483709</w:t>
+            </w:r>
+          </w:p>
+        </w:tc>
+        <w:tc>
+          <w:tcPr>
+            <w:tcW w:type="dxa" w:w="1662"/>
+          </w:tcPr>
+          <w:p>
+            <w:r>
+              <w:t>+0.014345050</w:t>
+            </w:r>
+          </w:p>
+        </w:tc>
+        <w:tc>
+          <w:tcPr>
+            <w:tcW w:type="dxa" w:w="1662"/>
+          </w:tcPr>
+          <w:p>
+            <w:r>
+              <w:t>-0.029197080</w:t>
+            </w:r>
+          </w:p>
+        </w:tc>
+        <w:tc>
+          <w:tcPr>
+            <w:tcW w:type="dxa" w:w="1662"/>
+          </w:tcPr>
+          <w:p>
+            <w:r>
+              <w:t>-0.046715328</w:t>
+            </w:r>
+          </w:p>
+        </w:tc>
+      </w:tr>
+      <w:tr>
+        <w:tc>
+          <w:tcPr>
+            <w:tcW w:type="dxa" w:w="1662"/>
+          </w:tcPr>
+          <w:p>
+            <w:r>
+              <w:t>数值筛查候选 f006</w:t>
+            </w:r>
+          </w:p>
+        </w:tc>
+        <w:tc>
+          <w:tcPr>
+            <w:tcW w:type="dxa" w:w="1662"/>
+          </w:tcPr>
+          <w:p>
+            <w:r>
+              <w:t>z-score / 0.6</w:t>
+            </w:r>
+          </w:p>
+        </w:tc>
+        <w:tc>
+          <w:tcPr>
+            <w:tcW w:type="dxa" w:w="1662"/>
+          </w:tcPr>
+          <w:p>
+            <w:r>
+              <w:t>0.114671709</w:t>
+            </w:r>
+          </w:p>
+        </w:tc>
+        <w:tc>
+          <w:tcPr>
+            <w:tcW w:type="dxa" w:w="1662"/>
+          </w:tcPr>
+          <w:p>
+            <w:r>
+              <w:t>+0.013533049</w:t>
+            </w:r>
+          </w:p>
+        </w:tc>
+        <w:tc>
+          <w:tcPr>
+            <w:tcW w:type="dxa" w:w="1662"/>
+          </w:tcPr>
+          <w:p>
+            <w:r>
+              <w:t>+0.010218978</w:t>
+            </w:r>
+          </w:p>
+        </w:tc>
+        <w:tc>
+          <w:tcPr>
+            <w:tcW w:type="dxa" w:w="1662"/>
+          </w:tcPr>
+          <w:p>
+            <w:r>
+              <w:t>-0.013138686</w:t>
+            </w:r>
+          </w:p>
+        </w:tc>
+      </w:tr>
+    </w:tbl>
+    <w:p>
+      <w:r>
+        <w:t>全局NDCG最高配置f016相对融合池Flat端点提升+0.014345050，但Row Recall@5下降-0.029197080、Cell Recall@5下降-0.046715328，因此不满足完整门槛。</w:t>
+      </w:r>
+    </w:p>
+    <w:p>
+      <w:r>
+        <w:t>唯一池内数值筛查候选f006的weighted NDCG提升+0.013533049，Row Recall@5提升+0.010218978，worst-client提升+0.004596939；Cell Recall@5变化-0.013138686。其数值满足三项局部门槛。</w:t>
+      </w:r>
+    </w:p>
+    <w:p>
+      <w:r>
+        <w:t>关键口径边界：冻结JSON只保存每路Top-10分数。融合池Flat端点weighted NDCG为0.101138660，原冻结全语料Flat参考值为0.145597802；因Row/Cell存在两套不重叠表示ID，二者绝对值不可直接比较。MRR/MAP也仅为截断融合池诊断指标。</w:t>
+      </w:r>
+    </w:p>
+    <w:p>
+      <w:r>
+        <w:t>稳定性边界：当前只有seed=42的冻结零样本分数，尚不能证明至少两个seed方向一致，也尚未证明收益不集中于单个结构质量桶。因此f006只能交由任务6审查，不能视为已冻结PASS。</w:t>
+      </w:r>
+    </w:p>
+    <w:p>
+      <w:pPr>
+        <w:pStyle w:val="Heading3"/>
+      </w:pPr>
+      <w:r>
+        <w:t>任务5最终验收：</w:t>
+      </w:r>
+    </w:p>
+    <w:p>
+      <w:r>
+        <w:t>☑ 仅使用dev冻结候选和分数，未读取test选alpha，未训练或重新编码。</w:t>
+      </w:r>
+    </w:p>
+    <w:p>
+      <w:r>
+        <w:t>☑ 三种归一化×11个alpha共33项完整输出，Flat/UniTable端点经过排序测试。</w:t>
+      </w:r>
+    </w:p>
+    <w:p>
+      <w:r>
+        <w:t>☑ 输出各层级NDCG、Recall@5、MRR、MAP及global、macro、worst-client和std。</w:t>
+      </w:r>
+    </w:p>
+    <w:p>
+      <w:r>
+        <w:t>☑ 输入/输出SHA256复算一致；完整项目测试29 passed、2 warnings。</w:t>
+      </w:r>
+    </w:p>
+    <w:p>
+      <w:r>
+        <w:t>☒ 当前结果受Top-10并集口径限制且缺少两seed稳定性证据，不得直接执行任务7。</w:t>
+      </w:r>
+    </w:p>
+    <w:p>
+      <w:r>
+        <w:t>下一步：执行任务6，仅基于dev统一审查任务4与任务5，并冻结frozen_config或fail_decision。</w:t>
+      </w:r>
+    </w:p>
+    <w:p>
+      <w:pPr>
         <w:pStyle w:val="Heading2"/>
         <w:spacing w:before="200" w:after="120"/>
       </w:pPr>
@@ -4176,6 +4863,434 @@
     </w:tbl>
     <w:p>
       <w:pPr>
+        <w:pStyle w:val="Heading3"/>
+      </w:pPr>
+      <w:r>
+        <w:t>任务 6实际执行与验收结果（2026-08-20）</w:t>
+      </w:r>
+    </w:p>
+    <w:p>
+      <w:r>
+        <w:t>执行状态：FAIL_NO_DEV_STRATEGY。任务6已仅基于dev统一审查none、gating、fusion和gating_plus_fusion；通过候选数为0，正式test未获授权。</w:t>
+      </w:r>
+    </w:p>
+    <w:p>
+      <w:pPr>
+        <w:pStyle w:val="ListBullet"/>
+      </w:pPr>
+      <w:r>
+        <w:t>实现脚本：src/evaluation/select_and_freeze_structure_strategy.py。脚本只读取任务4/5的dev网格、最佳配置和SHA256清单，不重新检索、不训练、不重新编码，并拒绝文件名含test的输入。</w:t>
+      </w:r>
+    </w:p>
+    <w:p>
+      <w:pPr>
+        <w:pStyle w:val="ListBullet"/>
+      </w:pPr>
+      <w:r>
+        <w:t>统一canonical Flat dev基线：weighted NDCG@10=0.145597802，Row Recall@5=0.327007299，Cell Recall@5=0.236496350，worst-client=0.099247224。</w:t>
+      </w:r>
+    </w:p>
+    <w:p>
+      <w:pPr>
+        <w:pStyle w:val="ListBullet"/>
+      </w:pPr>
+      <w:r>
+        <w:t>预注册门槛：Δweighted NDCG≥0.003；ΔRow或ΔCell Recall@5≥0.01；Δworst-client≥-0.005。所有候选均相对同一canonical Flat重新判定，不沿用网格内部标志。</w:t>
+      </w:r>
+    </w:p>
+    <w:p>
+      <w:pPr>
+        <w:pStyle w:val="ListBullet"/>
+      </w:pPr>
+      <w:r>
+        <w:t>输出：outputs/diagnosis/frozen_selection/fail_decision.json、freeze_manifest.json和dev_selection_report.md；未生成frozen_config.json。</w:t>
+      </w:r>
+    </w:p>
+    <w:tbl>
+      <w:tblPr>
+        <w:tblStyle w:val="TableGrid"/>
+        <w:tblW w:type="auto" w:w="0"/>
+        <w:tblLook w:firstColumn="1" w:firstRow="1" w:lastColumn="0" w:lastRow="0" w:noHBand="0" w:noVBand="1" w:val="04A0"/>
+      </w:tblPr>
+      <w:tblGrid>
+        <w:gridCol w:w="1662"/>
+        <w:gridCol w:w="1662"/>
+        <w:gridCol w:w="1662"/>
+        <w:gridCol w:w="1662"/>
+        <w:gridCol w:w="1662"/>
+        <w:gridCol w:w="1662"/>
+      </w:tblGrid>
+      <w:tr>
+        <w:tc>
+          <w:tcPr>
+            <w:tcW w:type="dxa" w:w="1662"/>
+          </w:tcPr>
+          <w:p>
+            <w:r>
+              <w:t>策略</w:t>
+            </w:r>
+          </w:p>
+        </w:tc>
+        <w:tc>
+          <w:tcPr>
+            <w:tcW w:type="dxa" w:w="1662"/>
+          </w:tcPr>
+          <w:p>
+            <w:r>
+              <w:t>配置</w:t>
+            </w:r>
+          </w:p>
+        </w:tc>
+        <w:tc>
+          <w:tcPr>
+            <w:tcW w:type="dxa" w:w="1662"/>
+          </w:tcPr>
+          <w:p>
+            <w:r>
+              <w:t>Weighted NDCG@10</w:t>
+            </w:r>
+          </w:p>
+        </w:tc>
+        <w:tc>
+          <w:tcPr>
+            <w:tcW w:type="dxa" w:w="1662"/>
+          </w:tcPr>
+          <w:p>
+            <w:r>
+              <w:t>ΔNDCG</w:t>
+            </w:r>
+          </w:p>
+        </w:tc>
+        <w:tc>
+          <w:tcPr>
+            <w:tcW w:type="dxa" w:w="1662"/>
+          </w:tcPr>
+          <w:p>
+            <w:r>
+              <w:t>协议可比</w:t>
+            </w:r>
+          </w:p>
+        </w:tc>
+        <w:tc>
+          <w:tcPr>
+            <w:tcW w:type="dxa" w:w="1662"/>
+          </w:tcPr>
+          <w:p>
+            <w:r>
+              <w:t>判定</w:t>
+            </w:r>
+          </w:p>
+        </w:tc>
+      </w:tr>
+      <w:tr>
+        <w:tc>
+          <w:tcPr>
+            <w:tcW w:type="dxa" w:w="1662"/>
+          </w:tcPr>
+          <w:p>
+            <w:r>
+              <w:t>none</w:t>
+            </w:r>
+          </w:p>
+        </w:tc>
+        <w:tc>
+          <w:tcPr>
+            <w:tcW w:type="dxa" w:w="1662"/>
+          </w:tcPr>
+          <w:p>
+            <w:r>
+              <w:t>g000</w:t>
+            </w:r>
+          </w:p>
+        </w:tc>
+        <w:tc>
+          <w:tcPr>
+            <w:tcW w:type="dxa" w:w="1662"/>
+          </w:tcPr>
+          <w:p>
+            <w:r>
+              <w:t>0.145597802</w:t>
+            </w:r>
+          </w:p>
+        </w:tc>
+        <w:tc>
+          <w:tcPr>
+            <w:tcW w:type="dxa" w:w="1662"/>
+          </w:tcPr>
+          <w:p>
+            <w:r>
+              <w:t>+0.000000000</w:t>
+            </w:r>
+          </w:p>
+        </w:tc>
+        <w:tc>
+          <w:tcPr>
+            <w:tcW w:type="dxa" w:w="1662"/>
+          </w:tcPr>
+          <w:p>
+            <w:r>
+              <w:t>是</w:t>
+            </w:r>
+          </w:p>
+        </w:tc>
+        <w:tc>
+          <w:tcPr>
+            <w:tcW w:type="dxa" w:w="1662"/>
+          </w:tcPr>
+          <w:p>
+            <w:r>
+              <w:t>FAIL：无提升</w:t>
+            </w:r>
+          </w:p>
+        </w:tc>
+      </w:tr>
+      <w:tr>
+        <w:tc>
+          <w:tcPr>
+            <w:tcW w:type="dxa" w:w="1662"/>
+          </w:tcPr>
+          <w:p>
+            <w:r>
+              <w:t>gating</w:t>
+            </w:r>
+          </w:p>
+        </w:tc>
+        <w:tc>
+          <w:tcPr>
+            <w:tcW w:type="dxa" w:w="1662"/>
+          </w:tcPr>
+          <w:p>
+            <w:r>
+              <w:t>g008</w:t>
+            </w:r>
+          </w:p>
+        </w:tc>
+        <w:tc>
+          <w:tcPr>
+            <w:tcW w:type="dxa" w:w="1662"/>
+          </w:tcPr>
+          <w:p>
+            <w:r>
+              <w:t>0.145597802</w:t>
+            </w:r>
+          </w:p>
+        </w:tc>
+        <w:tc>
+          <w:tcPr>
+            <w:tcW w:type="dxa" w:w="1662"/>
+          </w:tcPr>
+          <w:p>
+            <w:r>
+              <w:t>+0.000000000</w:t>
+            </w:r>
+          </w:p>
+        </w:tc>
+        <w:tc>
+          <w:tcPr>
+            <w:tcW w:type="dxa" w:w="1662"/>
+          </w:tcPr>
+          <w:p>
+            <w:r>
+              <w:t>是</w:t>
+            </w:r>
+          </w:p>
+        </w:tc>
+        <w:tc>
+          <w:tcPr>
+            <w:tcW w:type="dxa" w:w="1662"/>
+          </w:tcPr>
+          <w:p>
+            <w:r>
+              <w:t>FAIL</w:t>
+            </w:r>
+          </w:p>
+        </w:tc>
+      </w:tr>
+      <w:tr>
+        <w:tc>
+          <w:tcPr>
+            <w:tcW w:type="dxa" w:w="1662"/>
+          </w:tcPr>
+          <w:p>
+            <w:r>
+              <w:t>fusion</w:t>
+            </w:r>
+          </w:p>
+        </w:tc>
+        <w:tc>
+          <w:tcPr>
+            <w:tcW w:type="dxa" w:w="1662"/>
+          </w:tcPr>
+          <w:p>
+            <w:r>
+              <w:t>f016</w:t>
+            </w:r>
+          </w:p>
+        </w:tc>
+        <w:tc>
+          <w:tcPr>
+            <w:tcW w:type="dxa" w:w="1662"/>
+          </w:tcPr>
+          <w:p>
+            <w:r>
+              <w:t>0.115483709</w:t>
+            </w:r>
+          </w:p>
+        </w:tc>
+        <w:tc>
+          <w:tcPr>
+            <w:tcW w:type="dxa" w:w="1662"/>
+          </w:tcPr>
+          <w:p>
+            <w:r>
+              <w:t>-0.030114093</w:t>
+            </w:r>
+          </w:p>
+        </w:tc>
+        <w:tc>
+          <w:tcPr>
+            <w:tcW w:type="dxa" w:w="1662"/>
+          </w:tcPr>
+          <w:p>
+            <w:r>
+              <w:t>否：Top-10 union</w:t>
+            </w:r>
+          </w:p>
+        </w:tc>
+        <w:tc>
+          <w:tcPr>
+            <w:tcW w:type="dxa" w:w="1662"/>
+          </w:tcPr>
+          <w:p>
+            <w:r>
+              <w:t>FAIL</w:t>
+            </w:r>
+          </w:p>
+        </w:tc>
+      </w:tr>
+      <w:tr>
+        <w:tc>
+          <w:tcPr>
+            <w:tcW w:type="dxa" w:w="1662"/>
+          </w:tcPr>
+          <w:p>
+            <w:r>
+              <w:t>gating+fusion</w:t>
+            </w:r>
+          </w:p>
+        </w:tc>
+        <w:tc>
+          <w:tcPr>
+            <w:tcW w:type="dxa" w:w="1662"/>
+          </w:tcPr>
+          <w:p>
+            <w:r>
+              <w:t>NA</w:t>
+            </w:r>
+          </w:p>
+        </w:tc>
+        <w:tc>
+          <w:tcPr>
+            <w:tcW w:type="dxa" w:w="1662"/>
+          </w:tcPr>
+          <w:p>
+            <w:r>
+              <w:t>NA</w:t>
+            </w:r>
+          </w:p>
+        </w:tc>
+        <w:tc>
+          <w:tcPr>
+            <w:tcW w:type="dxa" w:w="1662"/>
+          </w:tcPr>
+          <w:p>
+            <w:r>
+              <w:t>NA</w:t>
+            </w:r>
+          </w:p>
+        </w:tc>
+        <w:tc>
+          <w:tcPr>
+            <w:tcW w:type="dxa" w:w="1662"/>
+          </w:tcPr>
+          <w:p>
+            <w:r>
+              <w:t>否：无独立dev网格</w:t>
+            </w:r>
+          </w:p>
+        </w:tc>
+        <w:tc>
+          <w:tcPr>
+            <w:tcW w:type="dxa" w:w="1662"/>
+          </w:tcPr>
+          <w:p>
+            <w:r>
+              <w:t>不可评估/FAIL</w:t>
+            </w:r>
+          </w:p>
+        </w:tc>
+      </w:tr>
+    </w:tbl>
+    <w:p>
+      <w:r>
+        <w:t>最佳gating配置g008与Flat完全持平，Δweighted NDCG=+0.000000000，未达到0.003门槛。</w:t>
+      </w:r>
+    </w:p>
+    <w:p>
+      <w:r>
+        <w:t>fusion最高配置f016的池内weighted NDCG=0.115483709；相对canonical Flat为-0.030114093，Row/Cell Recall和worst-client也未同时过门槛，且Top-10 union与全语料Flat口径不完全可比。</w:t>
+      </w:r>
+    </w:p>
+    <w:p>
+      <w:r>
+        <w:t>gating_plus_fusion没有独立dev网格；任务6没有拼接任务4/5最佳参数或伪造组合指标，因此按不可评估/未通过处理。</w:t>
+      </w:r>
+    </w:p>
+    <w:p>
+      <w:r>
+        <w:t>冻结决定：生成fail_decision.json并记录formal_test_authorized=false；不生成frozen_config.json，从产物层面阻止任务7读取或启动正式test。</w:t>
+      </w:r>
+    </w:p>
+    <w:p>
+      <w:pPr>
+        <w:pStyle w:val="Heading3"/>
+      </w:pPr>
+      <w:r>
+        <w:t>任务6最终验收：</w:t>
+      </w:r>
+    </w:p>
+    <w:p>
+      <w:r>
+        <w:t>☑ 方案选择完全基于dev，test_accessed=false。</w:t>
+      </w:r>
+    </w:p>
+    <w:p>
+      <w:r>
+        <w:t>☑ 四类候选均有明确审查结果，统一使用canonical Flat和预注册门槛。</w:t>
+      </w:r>
+    </w:p>
+    <w:p>
+      <w:r>
+        <w:t>☑ 6个上游输入、选择脚本及2个决策输出的SHA256复算一致。</w:t>
+      </w:r>
+    </w:p>
+    <w:p>
+      <w:r>
+        <w:t>☑ 完整项目测试33 passed、2 warnings；冻结目录不存在frozen_config.json。</w:t>
+      </w:r>
+    </w:p>
+    <w:p>
+      <w:r>
+        <w:t>☒ 无候选通过门槛，任务7正式test和任务8最小联邦验证均不得执行。</w:t>
+      </w:r>
+    </w:p>
+    <w:p>
+      <w:r>
+        <w:t>下一步：按实验工作安排跳过任务7和任务8，进入任务9，冻结结构分支负结果并转向问答端数值推理、证据重排序或program generation。</w:t>
+      </w:r>
+    </w:p>
+    <w:p>
+      <w:pPr>
         <w:pStyle w:val="Heading2"/>
         <w:spacing w:before="200" w:after="120"/>
       </w:pPr>
@@ -5179,6 +6294,591 @@
         </w:tc>
       </w:tr>
     </w:tbl>
+    <w:p>
+      <w:pPr>
+        <w:pStyle w:val="Heading3"/>
+      </w:pPr>
+      <w:r>
+        <w:t>任务 9实际执行与验收结果（2026-08-20）</w:t>
+      </w:r>
+    </w:p>
+    <w:p>
+      <w:r>
+        <w:t>执行状态：STOP_STRUCTURE_BRANCH_AND_PIVOT_QA。任务6已冻结为FAIL_NO_DEV_STRATEGY，任务7和任务8按门槛跳过；任务9已完成结构分支负结果冻结和问答端错误案例导出。</w:t>
+      </w:r>
+    </w:p>
+    <w:p>
+      <w:pPr>
+        <w:pStyle w:val="ListBullet"/>
+      </w:pPr>
+      <w:r>
+        <w:t>实现脚本：src/evaluation/finalize_structure_branch_and_plan_qa.py。脚本先验证formal_test_authorized=false且不存在frozen_config.json，再读取Day9/Day10冻结产物，不启动训练或新test。</w:t>
+      </w:r>
+    </w:p>
+    <w:p>
+      <w:pPr>
+        <w:pStyle w:val="ListBullet"/>
+      </w:pPr>
+      <w:r>
+        <w:t>停止决定：不再继续扩大当前结构联邦训练预算，不再试探学习率、训练轮数、候选队列大小、损失权重或聚合策略。</w:t>
+      </w:r>
+    </w:p>
+    <w:p>
+      <w:pPr>
+        <w:pStyle w:val="ListBullet"/>
+      </w:pPr>
+      <w:r>
+        <w:t>输出：outputs/diagnosis/stop_structure_branch_report.md、negative_result_summary.csv、outputs/qa_next/qa_numeric_error_cases.xlsx、next_stage_qa_plan.md和task9_sha256_manifest.json。</w:t>
+      </w:r>
+    </w:p>
+    <w:tbl>
+      <w:tblPr>
+        <w:tblStyle w:val="TableGrid"/>
+        <w:tblW w:type="auto" w:w="0"/>
+        <w:tblLook w:firstColumn="1" w:firstRow="1" w:lastColumn="0" w:lastRow="0" w:noHBand="0" w:noVBand="1" w:val="04A0"/>
+      </w:tblPr>
+      <w:tblGrid>
+        <w:gridCol w:w="1994"/>
+        <w:gridCol w:w="1994"/>
+        <w:gridCol w:w="1994"/>
+        <w:gridCol w:w="1994"/>
+        <w:gridCol w:w="1994"/>
+      </w:tblGrid>
+      <w:tr>
+        <w:tc>
+          <w:tcPr>
+            <w:tcW w:type="dxa" w:w="1994"/>
+          </w:tcPr>
+          <w:p>
+            <w:r>
+              <w:t>方法</w:t>
+            </w:r>
+          </w:p>
+        </w:tc>
+        <w:tc>
+          <w:tcPr>
+            <w:tcW w:type="dxa" w:w="1994"/>
+          </w:tcPr>
+          <w:p>
+            <w:r>
+              <w:t>Seed 42 weighted NDCG</w:t>
+            </w:r>
+          </w:p>
+        </w:tc>
+        <w:tc>
+          <w:tcPr>
+            <w:tcW w:type="dxa" w:w="1994"/>
+          </w:tcPr>
+          <w:p>
+            <w:r>
+              <w:t>三seed均值</w:t>
+            </w:r>
+          </w:p>
+        </w:tc>
+        <w:tc>
+          <w:tcPr>
+            <w:tcW w:type="dxa" w:w="1994"/>
+          </w:tcPr>
+          <w:p>
+            <w:r>
+              <w:t>三seed标准差</w:t>
+            </w:r>
+          </w:p>
+        </w:tc>
+        <w:tc>
+          <w:tcPr>
+            <w:tcW w:type="dxa" w:w="1994"/>
+          </w:tcPr>
+          <w:p>
+            <w:r>
+              <w:t>QA-100数值EM</w:t>
+            </w:r>
+          </w:p>
+        </w:tc>
+      </w:tr>
+      <w:tr>
+        <w:tc>
+          <w:tcPr>
+            <w:tcW w:type="dxa" w:w="1994"/>
+          </w:tcPr>
+          <w:p>
+            <w:r>
+              <w:t>FedE4RAG-Flat</w:t>
+            </w:r>
+          </w:p>
+        </w:tc>
+        <w:tc>
+          <w:tcPr>
+            <w:tcW w:type="dxa" w:w="1994"/>
+          </w:tcPr>
+          <w:p>
+            <w:r>
+              <w:t>0.256154</w:t>
+            </w:r>
+          </w:p>
+        </w:tc>
+        <w:tc>
+          <w:tcPr>
+            <w:tcW w:type="dxa" w:w="1994"/>
+          </w:tcPr>
+          <w:p>
+            <w:r>
+              <w:t>0.253853</w:t>
+            </w:r>
+          </w:p>
+        </w:tc>
+        <w:tc>
+          <w:tcPr>
+            <w:tcW w:type="dxa" w:w="1994"/>
+          </w:tcPr>
+          <w:p>
+            <w:r>
+              <w:t>0.002729</w:t>
+            </w:r>
+          </w:p>
+        </w:tc>
+        <w:tc>
+          <w:tcPr>
+            <w:tcW w:type="dxa" w:w="1994"/>
+          </w:tcPr>
+          <w:p>
+            <w:r>
+              <w:t>0.07</w:t>
+            </w:r>
+          </w:p>
+        </w:tc>
+      </w:tr>
+      <w:tr>
+        <w:tc>
+          <w:tcPr>
+            <w:tcW w:type="dxa" w:w="1994"/>
+          </w:tcPr>
+          <w:p>
+            <w:r>
+              <w:t>FedE4RAG-UniTable</w:t>
+            </w:r>
+          </w:p>
+        </w:tc>
+        <w:tc>
+          <w:tcPr>
+            <w:tcW w:type="dxa" w:w="1994"/>
+          </w:tcPr>
+          <w:p>
+            <w:r>
+              <w:t>0.229914</w:t>
+            </w:r>
+          </w:p>
+        </w:tc>
+        <w:tc>
+          <w:tcPr>
+            <w:tcW w:type="dxa" w:w="1994"/>
+          </w:tcPr>
+          <w:p>
+            <w:r>
+              <w:t>0.228222</w:t>
+            </w:r>
+          </w:p>
+        </w:tc>
+        <w:tc>
+          <w:tcPr>
+            <w:tcW w:type="dxa" w:w="1994"/>
+          </w:tcPr>
+          <w:p>
+            <w:r>
+              <w:t>0.002067</w:t>
+            </w:r>
+          </w:p>
+        </w:tc>
+        <w:tc>
+          <w:tcPr>
+            <w:tcW w:type="dxa" w:w="1994"/>
+          </w:tcPr>
+          <w:p>
+            <w:r>
+              <w:t>0.07</w:t>
+            </w:r>
+          </w:p>
+        </w:tc>
+      </w:tr>
+      <w:tr>
+        <w:tc>
+          <w:tcPr>
+            <w:tcW w:type="dxa" w:w="1994"/>
+          </w:tcPr>
+          <w:p>
+            <w:r>
+              <w:t>FedTabRAG-Full(R+U)</w:t>
+            </w:r>
+          </w:p>
+        </w:tc>
+        <w:tc>
+          <w:tcPr>
+            <w:tcW w:type="dxa" w:w="1994"/>
+          </w:tcPr>
+          <w:p>
+            <w:r>
+              <w:t>0.226521</w:t>
+            </w:r>
+          </w:p>
+        </w:tc>
+        <w:tc>
+          <w:tcPr>
+            <w:tcW w:type="dxa" w:w="1994"/>
+          </w:tcPr>
+          <w:p>
+            <w:r>
+              <w:t>0.226747</w:t>
+            </w:r>
+          </w:p>
+        </w:tc>
+        <w:tc>
+          <w:tcPr>
+            <w:tcW w:type="dxa" w:w="1994"/>
+          </w:tcPr>
+          <w:p>
+            <w:r>
+              <w:t>0.000191</w:t>
+            </w:r>
+          </w:p>
+        </w:tc>
+        <w:tc>
+          <w:tcPr>
+            <w:tcW w:type="dxa" w:w="1994"/>
+          </w:tcPr>
+          <w:p>
+            <w:r>
+              <w:t>0.05</w:t>
+            </w:r>
+          </w:p>
+        </w:tc>
+      </w:tr>
+    </w:tbl>
+    <w:p>
+      <w:r>
+        <w:t>结构证据汇总：UniTable S-TEDS=0.922466、Valid HTML=1.000000、cell-count exact=0.977332，但没有超过Flat。5/10/20/30%结构扰动下weighted NDCG绝对下降分别为0.002179、0.003841、0.004595、0.008947，说明结构信号被使用，但当前有效性不足。</w:t>
+      </w:r>
+    </w:p>
+    <w:p>
+      <w:r>
+        <w:t>任务4门控没有提升canonical Flat；任务5融合受冻结Top-10 union及跨分支表示ID口径限制；任务6统一审查none、gating、fusion、gating_plus_fusion的通过数为0。</w:t>
+      </w:r>
+    </w:p>
+    <w:tbl>
+      <w:tblPr>
+        <w:tblStyle w:val="TableGrid"/>
+        <w:tblW w:type="auto" w:w="0"/>
+        <w:tblLook w:firstColumn="1" w:firstRow="1" w:lastColumn="0" w:lastRow="0" w:noHBand="0" w:noVBand="1" w:val="04A0"/>
+      </w:tblPr>
+      <w:tblGrid>
+        <w:gridCol w:w="3324"/>
+        <w:gridCol w:w="3324"/>
+        <w:gridCol w:w="3324"/>
+      </w:tblGrid>
+      <w:tr>
+        <w:tc>
+          <w:tcPr>
+            <w:tcW w:type="dxa" w:w="3324"/>
+          </w:tcPr>
+          <w:p>
+            <w:r>
+              <w:t>QA错误案例</w:t>
+            </w:r>
+          </w:p>
+        </w:tc>
+        <w:tc>
+          <w:tcPr>
+            <w:tcW w:type="dxa" w:w="3324"/>
+          </w:tcPr>
+          <w:p>
+            <w:r>
+              <w:t>数量</w:t>
+            </w:r>
+          </w:p>
+        </w:tc>
+        <w:tc>
+          <w:tcPr>
+            <w:tcW w:type="dxa" w:w="3324"/>
+          </w:tcPr>
+          <w:p>
+            <w:r>
+              <w:t>用途</w:t>
+            </w:r>
+          </w:p>
+        </w:tc>
+      </w:tr>
+      <w:tr>
+        <w:tc>
+          <w:tcPr>
+            <w:tcW w:type="dxa" w:w="3324"/>
+          </w:tcPr>
+          <w:p>
+            <w:r>
+              <w:t>方法×query案例</w:t>
+            </w:r>
+          </w:p>
+        </w:tc>
+        <w:tc>
+          <w:tcPr>
+            <w:tcW w:type="dxa" w:w="3324"/>
+          </w:tcPr>
+          <w:p>
+            <w:r>
+              <w:t>468</w:t>
+            </w:r>
+          </w:p>
+        </w:tc>
+        <w:tc>
+          <w:tcPr>
+            <w:tcW w:type="dxa" w:w="3324"/>
+          </w:tcPr>
+          <w:p>
+            <w:r>
+              <w:t>gold Top-5命中且numerical EM=false</w:t>
+            </w:r>
+          </w:p>
+        </w:tc>
+      </w:tr>
+      <w:tr>
+        <w:tc>
+          <w:tcPr>
+            <w:tcW w:type="dxa" w:w="3324"/>
+          </w:tcPr>
+          <w:p>
+            <w:r>
+              <w:t>唯一query</w:t>
+            </w:r>
+          </w:p>
+        </w:tc>
+        <w:tc>
+          <w:tcPr>
+            <w:tcW w:type="dxa" w:w="3324"/>
+          </w:tcPr>
+          <w:p>
+            <w:r>
+              <w:t>72</w:t>
+            </w:r>
+          </w:p>
+        </w:tc>
+        <w:tc>
+          <w:tcPr>
+            <w:tcW w:type="dxa" w:w="3324"/>
+          </w:tcPr>
+          <w:p>
+            <w:r>
+              <w:t>跨方法归并后的问题覆盖</w:t>
+            </w:r>
+          </w:p>
+        </w:tc>
+      </w:tr>
+      <w:tr>
+        <w:tc>
+          <w:tcPr>
+            <w:tcW w:type="dxa" w:w="3324"/>
+          </w:tcPr>
+          <w:p>
+            <w:r>
+              <w:t>Flat优先案例</w:t>
+            </w:r>
+          </w:p>
+        </w:tc>
+        <w:tc>
+          <w:tcPr>
+            <w:tcW w:type="dxa" w:w="3324"/>
+          </w:tcPr>
+          <w:p>
+            <w:r>
+              <w:t>47</w:t>
+            </w:r>
+          </w:p>
+        </w:tc>
+        <w:tc>
+          <w:tcPr>
+            <w:tcW w:type="dxa" w:w="3324"/>
+          </w:tcPr>
+          <w:p>
+            <w:r>
+              <w:t>下一步人工审核首批</w:t>
+            </w:r>
+          </w:p>
+        </w:tc>
+      </w:tr>
+      <w:tr>
+        <w:tc>
+          <w:tcPr>
+            <w:tcW w:type="dxa" w:w="3324"/>
+          </w:tcPr>
+          <w:p>
+            <w:r>
+              <w:t>格式匹配失败</w:t>
+            </w:r>
+          </w:p>
+        </w:tc>
+        <w:tc>
+          <w:tcPr>
+            <w:tcW w:type="dxa" w:w="3324"/>
+          </w:tcPr>
+          <w:p>
+            <w:r>
+              <w:t>179</w:t>
+            </w:r>
+          </w:p>
+        </w:tc>
+        <w:tc>
+          <w:tcPr>
+            <w:tcW w:type="dxa" w:w="3324"/>
+          </w:tcPr>
+          <w:p>
+            <w:r>
+              <w:t>答案格式与数值解析</w:t>
+            </w:r>
+          </w:p>
+        </w:tc>
+      </w:tr>
+      <w:tr>
+        <w:tc>
+          <w:tcPr>
+            <w:tcW w:type="dxa" w:w="3324"/>
+          </w:tcPr>
+          <w:p>
+            <w:r>
+              <w:t>数字提取失败</w:t>
+            </w:r>
+          </w:p>
+        </w:tc>
+        <w:tc>
+          <w:tcPr>
+            <w:tcW w:type="dxa" w:w="3324"/>
+          </w:tcPr>
+          <w:p>
+            <w:r>
+              <w:t>26</w:t>
+            </w:r>
+          </w:p>
+        </w:tc>
+        <w:tc>
+          <w:tcPr>
+            <w:tcW w:type="dxa" w:w="3324"/>
+          </w:tcPr>
+          <w:p>
+            <w:r>
+              <w:t>操作数抽取</w:t>
+            </w:r>
+          </w:p>
+        </w:tc>
+      </w:tr>
+      <w:tr>
+        <w:tc>
+          <w:tcPr>
+            <w:tcW w:type="dxa" w:w="3324"/>
+          </w:tcPr>
+          <w:p>
+            <w:r>
+              <w:t>运算失败</w:t>
+            </w:r>
+          </w:p>
+        </w:tc>
+        <w:tc>
+          <w:tcPr>
+            <w:tcW w:type="dxa" w:w="3324"/>
+          </w:tcPr>
+          <w:p>
+            <w:r>
+              <w:t>140</w:t>
+            </w:r>
+          </w:p>
+        </w:tc>
+        <w:tc>
+          <w:tcPr>
+            <w:tcW w:type="dxa" w:w="3324"/>
+          </w:tcPr>
+          <w:p>
+            <w:r>
+              <w:t>数值推理/program generation</w:t>
+            </w:r>
+          </w:p>
+        </w:tc>
+      </w:tr>
+      <w:tr>
+        <w:tc>
+          <w:tcPr>
+            <w:tcW w:type="dxa" w:w="3324"/>
+          </w:tcPr>
+          <w:p>
+            <w:r>
+              <w:t>结构定位失败</w:t>
+            </w:r>
+          </w:p>
+        </w:tc>
+        <w:tc>
+          <w:tcPr>
+            <w:tcW w:type="dxa" w:w="3324"/>
+          </w:tcPr>
+          <w:p>
+            <w:r>
+              <w:t>123</w:t>
+            </w:r>
+          </w:p>
+        </w:tc>
+        <w:tc>
+          <w:tcPr>
+            <w:tcW w:type="dxa" w:w="3324"/>
+          </w:tcPr>
+          <w:p>
+            <w:r>
+              <w:t>Flat Top-k内证据重排序</w:t>
+            </w:r>
+          </w:p>
+        </w:tc>
+      </w:tr>
+    </w:tbl>
+    <w:p>
+      <w:r>
+        <w:t>Program边界：10种方法的program_predicted均为false，没有任何真实program输出；Program Accuracy和Execution Accuracy继续记为NA，不补写或推断数值。</w:t>
+      </w:r>
+    </w:p>
+    <w:p>
+      <w:r>
+        <w:t>表述边界：结论仅适用于受控渲染FinQA、oracle cell text保持不变、冻结BGE及既定联邦预算，不得外推为真实PDF端到端表格理解普遍无效。</w:t>
+      </w:r>
+    </w:p>
+    <w:p>
+      <w:pPr>
+        <w:pStyle w:val="Heading3"/>
+      </w:pPr>
+      <w:r>
+        <w:t>任务9最终验收：</w:t>
+      </w:r>
+    </w:p>
+    <w:p>
+      <w:r>
+        <w:t>☑ 已明确冻结并停止扩大当前结构联邦分支预算。</w:t>
+      </w:r>
+    </w:p>
+    <w:p>
+      <w:r>
+        <w:t>☑ 已生成结构负结果报告和negative_result_summary.csv。</w:t>
+      </w:r>
+    </w:p>
+    <w:p>
+      <w:r>
+        <w:t>☑ Excel包含468个gold-hit但答案错误的方法×query案例，覆盖72个query。</w:t>
+      </w:r>
+    </w:p>
+    <w:p>
+      <w:r>
+        <w:t>☑ Flat优先47条已置于Excel前部；program/execution字段全部为NA。</w:t>
+      </w:r>
+    </w:p>
+    <w:p>
+      <w:r>
+        <w:t>☑ XLSX压缩结构、输入/输出SHA256和案例筛选复算一致；完整项目测试36 passed、2 warnings。</w:t>
+      </w:r>
+    </w:p>
+    <w:p>
+      <w:r>
+        <w:t>下一阶段：先人工审核47条Flat优先案例；随后只在FinQA dev上开发证据重排序、数值操作数抽取和显式program generation，冻结配置后test只运行一次。固定QA-100不得用于重新调参。</w:t>
+      </w:r>
+    </w:p>
     <w:p>
       <w:pPr>
         <w:pStyle w:val="Heading1"/>

</xml_diff>